<commit_message>
Update all class name
+ last update on docx
</commit_message>
<xml_diff>
--- a/p26/Hero.docx
+++ b/p26/Hero.docx
@@ -1471,12 +1471,46 @@
               </w:rPr>
               <w:t xml:space="preserve">Son / </w:t>
             </w:r>
+            <w:proofErr w:type="gramStart"/>
             <w:r>
               <w:rPr>
                 <w:lang w:val="en-GB"/>
               </w:rPr>
               <w:t>Ous</w:t>
             </w:r>
+            <w:r>
+              <w:rPr>
+                <w:lang w:val="en-GB"/>
+              </w:rPr>
+              <w:t xml:space="preserve"> </w:t>
+            </w:r>
+            <w:r>
+              <w:rPr>
+                <w:sz w:val="16"/>
+                <w:szCs w:val="16"/>
+                <w:lang w:val="en-GB"/>
+              </w:rPr>
+              <w:t>:</w:t>
+            </w:r>
+            <w:proofErr w:type="gramEnd"/>
+            <w:r>
+              <w:rPr>
+                <w:sz w:val="16"/>
+                <w:szCs w:val="16"/>
+                <w:lang w:val="en-GB"/>
+              </w:rPr>
+              <w:t xml:space="preserve"> </w:t>
+            </w:r>
+            <w:proofErr w:type="spellStart"/>
+            <w:r>
+              <w:rPr>
+                <w:sz w:val="16"/>
+                <w:szCs w:val="16"/>
+                <w:lang w:val="en-GB"/>
+              </w:rPr>
+              <w:t>oreille</w:t>
+            </w:r>
+            <w:proofErr w:type="spellEnd"/>
           </w:p>
         </w:tc>
       </w:tr>
@@ -1912,31 +1946,6 @@
         </w:tc>
       </w:tr>
     </w:tbl>
-    <w:p>
-      <w:pPr>
-        <w:rPr>
-          <w:lang w:val="en-GB"/>
-        </w:rPr>
-      </w:pPr>
-    </w:p>
-    <w:p>
-      <w:r>
-        <w:t>S</w:t>
-      </w:r>
-      <w:r>
-        <w:t>ON</w:t>
-      </w:r>
-    </w:p>
-    <w:p>
-      <w:r>
-        <w:t>OUS : oreille en grec</w:t>
-      </w:r>
-    </w:p>
-    <w:p>
-      <w:r>
-        <w:t>ONE : suffixe atomique</w:t>
-      </w:r>
-    </w:p>
     <w:p/>
     <w:sectPr>
       <w:pgSz w:w="11906" w:h="16838"/>

</xml_diff>